<commit_message>
Correct title to Managing Director; add NCNDA/outreach templates for deal brokerage
</commit_message>
<xml_diff>
--- a/funding_applications/usaid_div/USAID_DIV_ZeroPay_Draft.docx
+++ b/funding_applications/usaid_div/USAID_DIV_ZeroPay_Draft.docx
@@ -40,7 +40,7 @@
         <w:spacing w:after="200"/>
       </w:pPr>
       <w:r>
-        <w:t>BETONIQ WEST LTD (RC 1496603), a private company limited by shares, incorporated May 20, 2018, based in Abuja, Nigeria. Applicant: Tom Ugbodaga, Shareholder &amp; CEO. MSc Computer Systems Security (University of Gloucestershire, England, 2011).</w:t>
+        <w:t>BETONIQ WEST LTD (RC 1496603), a private company limited by shares, incorporated May 20, 2018, based in Abuja, Nigeria. Applicant: Tom Ugbodaga, Managing Director. MSc Computer Systems Security (University of Gloucestershire, England, 2011).</w:t>
       </w:r>
     </w:p>
     <w:p>
@@ -142,7 +142,7 @@
         <w:spacing w:after="200"/>
       </w:pPr>
       <w:r>
-        <w:t>Tom Ugbodaga, Shareholder &amp; CEO, holds an MSc in Computer Systems Security (University of Gloucestershire, England, 2011). Air Vice Marshal Monday Riku Morgan (Rtd) serves as Executive Vice Chairman, providing institutional and governance credibility. Full team and technical documentation available on request.</w:t>
+        <w:t>Tom Ugbodaga, Managing Director, holds an MSc in Computer Systems Security (University of Gloucestershire, England, 2011). Air Vice Marshal Monday Riku Morgan (Rtd) serves as Executive Vice Chairman, providing institutional and governance credibility. Full team and technical documentation available on request.</w:t>
       </w:r>
     </w:p>
     <w:p/>

</xml_diff>